<commit_message>
atualização das paginas home,serviços,contato
</commit_message>
<xml_diff>
--- a/DOC/Documentação.docx
+++ b/DOC/Documentação.docx
@@ -2376,6 +2376,19 @@
     </w:p>
     <w:p>
       <w:r>
+        <w:t xml:space="preserve">De acordo com o escritor Roger Caras, </w:t>
+      </w:r>
+      <w:r>
+        <w:rPr>
+          <w:i/>
+          <w:iCs/>
+        </w:rPr>
+        <w:t>"Os animais de estimação não são nossa vida inteira, mas eles tornam nossas vidas completas."</w:t>
+      </w:r>
+      <w:r>
+        <w:t xml:space="preserve"> </w:t>
+      </w:r>
+      <w:r>
         <w:t>Atualmente, muitas pessoas têm animais de estimação e precisam adquirir produtos para manter a higiene, a saúde e o bem-estar de seus pets. Porém, nem sempre é fácil encontrar, em um único lugar, os itens necessários para atender às diferentes necessidades dos animais. Pensando nisso, o projeto consiste na criação de um pet shop online, onde os usuários poderão navegar pelo catálogo, conhecer os produtos disponíveis e realizar suas compras de maneira simples e prática.</w:t>
       </w:r>
     </w:p>
@@ -2788,7 +2801,6 @@
           <w:sz w:val="24"/>
           <w:szCs w:val="24"/>
         </w:rPr>
-        <w:lastRenderedPageBreak/>
         <w:t>2 DESENVOLVIMENTO</w:t>
       </w:r>
     </w:p>
@@ -3031,7 +3043,6 @@
           <w:b/>
           <w:bCs/>
         </w:rPr>
-        <w:lastRenderedPageBreak/>
         <w:t>3 METODOLOGIA OU PROCEDIMENTOS METODOLÓGICOS</w:t>
       </w:r>
     </w:p>
@@ -3301,7 +3312,6 @@
           <w:b/>
           <w:bCs/>
         </w:rPr>
-        <w:lastRenderedPageBreak/>
         <w:t>4 MÉTODOS</w:t>
       </w:r>
     </w:p>
@@ -3391,7 +3401,6 @@
           <w:b/>
           <w:bCs/>
         </w:rPr>
-        <w:lastRenderedPageBreak/>
         <w:t xml:space="preserve">5 APRESENTAÇÃO E </w:t>
       </w:r>
       <w:proofErr w:type="gramStart"/>
@@ -3529,7 +3538,6 @@
           <w:b/>
           <w:bCs/>
         </w:rPr>
-        <w:lastRenderedPageBreak/>
         <w:t>6 CONCLUSÃO</w:t>
       </w:r>
     </w:p>
@@ -3694,7 +3702,6 @@
           <w:b/>
           <w:bCs/>
         </w:rPr>
-        <w:lastRenderedPageBreak/>
         <w:t>7 REFERÊNCIAS</w:t>
       </w:r>
       <w:r>
@@ -4227,7 +4234,6 @@
   <w:style w:type="character" w:default="1" w:styleId="Fontepargpadro">
     <w:name w:val="Default Paragraph Font"/>
     <w:uiPriority w:val="1"/>
-    <w:semiHidden/>
     <w:unhideWhenUsed/>
   </w:style>
   <w:style w:type="table" w:default="1" w:styleId="Tabelanormal">

</xml_diff>

<commit_message>
adição da imegem da pagina galeria
</commit_message>
<xml_diff>
--- a/DOC/Documentação.docx
+++ b/DOC/Documentação.docx
@@ -1422,139 +1422,126 @@
           <w:bCs/>
           <w:sz w:val="24"/>
           <w:szCs w:val="24"/>
-          <w:lang w:val="en-US"/>
-        </w:rPr>
-      </w:pPr>
-    </w:p>
-    <w:p>
-      <w:pPr>
-        <w:rPr>
-          <w:b/>
-          <w:bCs/>
-          <w:sz w:val="24"/>
-          <w:szCs w:val="24"/>
-          <w:lang w:val="en-US"/>
-        </w:rPr>
-      </w:pPr>
-    </w:p>
-    <w:p>
-      <w:pPr>
-        <w:rPr>
-          <w:b/>
-          <w:bCs/>
-          <w:sz w:val="24"/>
-          <w:szCs w:val="24"/>
-          <w:lang w:val="en-US"/>
-        </w:rPr>
-      </w:pPr>
-    </w:p>
-    <w:p>
-      <w:pPr>
-        <w:rPr>
-          <w:b/>
-          <w:bCs/>
-          <w:sz w:val="24"/>
-          <w:szCs w:val="24"/>
-          <w:lang w:val="en-US"/>
-        </w:rPr>
-      </w:pPr>
-    </w:p>
-    <w:p>
-      <w:pPr>
-        <w:rPr>
-          <w:b/>
-          <w:bCs/>
-          <w:sz w:val="24"/>
-          <w:szCs w:val="24"/>
-          <w:lang w:val="en-US"/>
-        </w:rPr>
-      </w:pPr>
-    </w:p>
-    <w:p>
-      <w:pPr>
-        <w:rPr>
-          <w:b/>
-          <w:bCs/>
-          <w:sz w:val="24"/>
-          <w:szCs w:val="24"/>
-          <w:lang w:val="en-US"/>
-        </w:rPr>
-      </w:pPr>
-    </w:p>
-    <w:p>
-      <w:pPr>
-        <w:rPr>
-          <w:b/>
-          <w:bCs/>
-          <w:sz w:val="24"/>
-          <w:szCs w:val="24"/>
-          <w:lang w:val="en-US"/>
-        </w:rPr>
-      </w:pPr>
-    </w:p>
-    <w:p>
-      <w:pPr>
-        <w:rPr>
-          <w:b/>
-          <w:bCs/>
-          <w:sz w:val="24"/>
-          <w:szCs w:val="24"/>
-          <w:lang w:val="en-US"/>
-        </w:rPr>
-      </w:pPr>
-    </w:p>
-    <w:p>
-      <w:pPr>
-        <w:rPr>
-          <w:b/>
-          <w:bCs/>
-          <w:sz w:val="24"/>
-          <w:szCs w:val="24"/>
-          <w:lang w:val="en-US"/>
-        </w:rPr>
-      </w:pPr>
-    </w:p>
-    <w:p>
-      <w:pPr>
-        <w:rPr>
-          <w:b/>
-          <w:bCs/>
-          <w:sz w:val="24"/>
-          <w:szCs w:val="24"/>
-          <w:lang w:val="en-US"/>
-        </w:rPr>
-      </w:pPr>
-    </w:p>
-    <w:p>
-      <w:pPr>
-        <w:rPr>
-          <w:b/>
-          <w:bCs/>
-          <w:sz w:val="24"/>
-          <w:szCs w:val="24"/>
-          <w:lang w:val="en-US"/>
-        </w:rPr>
-      </w:pPr>
-    </w:p>
-    <w:p>
-      <w:pPr>
-        <w:rPr>
-          <w:b/>
-          <w:bCs/>
-          <w:sz w:val="24"/>
-          <w:szCs w:val="24"/>
-          <w:lang w:val="en-US"/>
-        </w:rPr>
-      </w:pPr>
-    </w:p>
-    <w:p>
-      <w:pPr>
-        <w:rPr>
-          <w:b/>
-          <w:bCs/>
-          <w:sz w:val="24"/>
-          <w:szCs w:val="24"/>
-          <w:lang w:val="en-US"/>
+        </w:rPr>
+      </w:pPr>
+    </w:p>
+    <w:p>
+      <w:pPr>
+        <w:rPr>
+          <w:b/>
+          <w:bCs/>
+          <w:sz w:val="24"/>
+          <w:szCs w:val="24"/>
+        </w:rPr>
+      </w:pPr>
+    </w:p>
+    <w:p>
+      <w:pPr>
+        <w:rPr>
+          <w:b/>
+          <w:bCs/>
+          <w:sz w:val="24"/>
+          <w:szCs w:val="24"/>
+        </w:rPr>
+      </w:pPr>
+    </w:p>
+    <w:p>
+      <w:pPr>
+        <w:rPr>
+          <w:b/>
+          <w:bCs/>
+          <w:sz w:val="24"/>
+          <w:szCs w:val="24"/>
+        </w:rPr>
+      </w:pPr>
+    </w:p>
+    <w:p>
+      <w:pPr>
+        <w:rPr>
+          <w:b/>
+          <w:bCs/>
+          <w:sz w:val="24"/>
+          <w:szCs w:val="24"/>
+        </w:rPr>
+      </w:pPr>
+    </w:p>
+    <w:p>
+      <w:pPr>
+        <w:rPr>
+          <w:b/>
+          <w:bCs/>
+          <w:sz w:val="24"/>
+          <w:szCs w:val="24"/>
+        </w:rPr>
+      </w:pPr>
+    </w:p>
+    <w:p>
+      <w:pPr>
+        <w:rPr>
+          <w:b/>
+          <w:bCs/>
+          <w:sz w:val="24"/>
+          <w:szCs w:val="24"/>
+        </w:rPr>
+      </w:pPr>
+    </w:p>
+    <w:p>
+      <w:pPr>
+        <w:rPr>
+          <w:b/>
+          <w:bCs/>
+          <w:sz w:val="24"/>
+          <w:szCs w:val="24"/>
+        </w:rPr>
+      </w:pPr>
+    </w:p>
+    <w:p>
+      <w:pPr>
+        <w:rPr>
+          <w:b/>
+          <w:bCs/>
+          <w:sz w:val="24"/>
+          <w:szCs w:val="24"/>
+        </w:rPr>
+      </w:pPr>
+    </w:p>
+    <w:p>
+      <w:pPr>
+        <w:rPr>
+          <w:b/>
+          <w:bCs/>
+          <w:sz w:val="24"/>
+          <w:szCs w:val="24"/>
+        </w:rPr>
+      </w:pPr>
+    </w:p>
+    <w:p>
+      <w:pPr>
+        <w:rPr>
+          <w:b/>
+          <w:bCs/>
+          <w:sz w:val="24"/>
+          <w:szCs w:val="24"/>
+        </w:rPr>
+      </w:pPr>
+    </w:p>
+    <w:p>
+      <w:pPr>
+        <w:rPr>
+          <w:b/>
+          <w:bCs/>
+          <w:sz w:val="24"/>
+          <w:szCs w:val="24"/>
+        </w:rPr>
+      </w:pPr>
+    </w:p>
+    <w:p>
+      <w:pPr>
+        <w:rPr>
+          <w:b/>
+          <w:bCs/>
+          <w:sz w:val="24"/>
+          <w:szCs w:val="24"/>
         </w:rPr>
       </w:pPr>
     </w:p>
@@ -1611,8 +1598,6 @@
     <w:sdt>
       <w:sdtPr>
         <w:rPr>
-          <w:rFonts w:ascii="Arial" w:eastAsia="Arial" w:hAnsi="Arial" w:cs="Arial"/>
-          <w:color w:val="auto"/>
           <w:sz w:val="24"/>
           <w:szCs w:val="24"/>
         </w:rPr>
@@ -1624,8 +1609,10 @@
       </w:sdtPr>
       <w:sdtEndPr>
         <w:rPr>
-          <w:b/>
-          <w:bCs/>
+          <w:rFonts w:ascii="Arial" w:eastAsia="Arial" w:hAnsi="Arial" w:cs="Arial"/>
+          <w:b/>
+          <w:bCs/>
+          <w:color w:val="auto"/>
         </w:rPr>
       </w:sdtEndPr>
       <w:sdtContent>
@@ -2822,7 +2809,23 @@
           <w:sz w:val="24"/>
           <w:szCs w:val="24"/>
         </w:rPr>
-        <w:t xml:space="preserve"> Mostra porquê estudar o tema proposto. Para quem o estudo do</w:t>
+        <w:t xml:space="preserve"> Mostra </w:t>
+      </w:r>
+      <w:proofErr w:type="gramStart"/>
+      <w:r>
+        <w:rPr>
+          <w:sz w:val="24"/>
+          <w:szCs w:val="24"/>
+        </w:rPr>
+        <w:t>porquê</w:t>
+      </w:r>
+      <w:proofErr w:type="gramEnd"/>
+      <w:r>
+        <w:rPr>
+          <w:sz w:val="24"/>
+          <w:szCs w:val="24"/>
+        </w:rPr>
+        <w:t xml:space="preserve"> estudar o tema proposto. Para quem o estudo do</w:t>
       </w:r>
     </w:p>
     <w:p>
@@ -2853,7 +2856,23 @@
           <w:szCs w:val="24"/>
         </w:rPr>
         <w:lastRenderedPageBreak/>
-        <w:t>trabalho/atuação? Por que este tema é importante para você (pesquisador).</w:t>
+        <w:t xml:space="preserve">trabalho/atuação? </w:t>
+      </w:r>
+      <w:proofErr w:type="gramStart"/>
+      <w:r>
+        <w:rPr>
+          <w:sz w:val="24"/>
+          <w:szCs w:val="24"/>
+        </w:rPr>
+        <w:t>Por que</w:t>
+      </w:r>
+      <w:proofErr w:type="gramEnd"/>
+      <w:r>
+        <w:rPr>
+          <w:sz w:val="24"/>
+          <w:szCs w:val="24"/>
+        </w:rPr>
+        <w:t xml:space="preserve"> este tema é importante para você (pesquisador).</w:t>
       </w:r>
     </w:p>
     <w:p>
@@ -2931,6 +2950,7 @@
         <w:t xml:space="preserve"> Esta pesquisa é oportuna neste momento? Ela </w:t>
       </w:r>
       <w:proofErr w:type="spellStart"/>
+      <w:proofErr w:type="gramStart"/>
       <w:r>
         <w:rPr>
           <w:sz w:val="24"/>
@@ -2939,6 +2959,7 @@
         <w:t>esta</w:t>
       </w:r>
       <w:proofErr w:type="spellEnd"/>
+      <w:proofErr w:type="gramEnd"/>
       <w:r>
         <w:rPr>
           <w:sz w:val="24"/>
@@ -3164,7 +3185,71 @@
           <w:sz w:val="24"/>
           <w:szCs w:val="24"/>
         </w:rPr>
-        <w:t xml:space="preserve">pois é observado que em muitos sites de pet shop a uma demora de atendimento e uma dificuldade com isso levando ao atendimento lento e de péssima qualidade, com isso o projeto consiste em melhorar isso , trazendo praticidade , segurança , bom serviço , atendimento mais rápido e um </w:t>
+        <w:t xml:space="preserve">pois é observado que em muitos sites de pet shop a uma demora de atendimento e uma dificuldade com isso levando ao atendimento lento e de péssima qualidade, com isso o projeto consiste em melhorar </w:t>
+      </w:r>
+      <w:proofErr w:type="gramStart"/>
+      <w:r>
+        <w:rPr>
+          <w:sz w:val="24"/>
+          <w:szCs w:val="24"/>
+        </w:rPr>
+        <w:t>isso ,</w:t>
+      </w:r>
+      <w:proofErr w:type="gramEnd"/>
+      <w:r>
+        <w:rPr>
+          <w:sz w:val="24"/>
+          <w:szCs w:val="24"/>
+        </w:rPr>
+        <w:t xml:space="preserve"> trazendo </w:t>
+      </w:r>
+      <w:proofErr w:type="gramStart"/>
+      <w:r>
+        <w:rPr>
+          <w:sz w:val="24"/>
+          <w:szCs w:val="24"/>
+        </w:rPr>
+        <w:t>praticidade ,</w:t>
+      </w:r>
+      <w:proofErr w:type="gramEnd"/>
+      <w:r>
+        <w:rPr>
+          <w:sz w:val="24"/>
+          <w:szCs w:val="24"/>
+        </w:rPr>
+        <w:t xml:space="preserve"> </w:t>
+      </w:r>
+      <w:proofErr w:type="gramStart"/>
+      <w:r>
+        <w:rPr>
+          <w:sz w:val="24"/>
+          <w:szCs w:val="24"/>
+        </w:rPr>
+        <w:t>segurança ,</w:t>
+      </w:r>
+      <w:proofErr w:type="gramEnd"/>
+      <w:r>
+        <w:rPr>
+          <w:sz w:val="24"/>
+          <w:szCs w:val="24"/>
+        </w:rPr>
+        <w:t xml:space="preserve"> bom </w:t>
+      </w:r>
+      <w:proofErr w:type="gramStart"/>
+      <w:r>
+        <w:rPr>
+          <w:sz w:val="24"/>
+          <w:szCs w:val="24"/>
+        </w:rPr>
+        <w:t>serviço ,</w:t>
+      </w:r>
+      <w:proofErr w:type="gramEnd"/>
+      <w:r>
+        <w:rPr>
+          <w:sz w:val="24"/>
+          <w:szCs w:val="24"/>
+        </w:rPr>
+        <w:t xml:space="preserve"> atendimento mais rápido e um </w:t>
       </w:r>
       <w:proofErr w:type="spellStart"/>
       <w:r>
@@ -3211,7 +3296,55 @@
           <w:sz w:val="24"/>
           <w:szCs w:val="24"/>
         </w:rPr>
-        <w:t xml:space="preserve">para usuários com animais de estimação , ele contribuirá para a melhoria de atendimentos , tendo uma velocidade de atendimento melhor , e um </w:t>
+        <w:t xml:space="preserve">para usuários com animais de </w:t>
+      </w:r>
+      <w:proofErr w:type="gramStart"/>
+      <w:r>
+        <w:rPr>
+          <w:sz w:val="24"/>
+          <w:szCs w:val="24"/>
+        </w:rPr>
+        <w:t>estimação ,</w:t>
+      </w:r>
+      <w:proofErr w:type="gramEnd"/>
+      <w:r>
+        <w:rPr>
+          <w:sz w:val="24"/>
+          <w:szCs w:val="24"/>
+        </w:rPr>
+        <w:t xml:space="preserve"> ele contribuirá para a melhoria de </w:t>
+      </w:r>
+      <w:proofErr w:type="gramStart"/>
+      <w:r>
+        <w:rPr>
+          <w:sz w:val="24"/>
+          <w:szCs w:val="24"/>
+        </w:rPr>
+        <w:t>atendimentos ,</w:t>
+      </w:r>
+      <w:proofErr w:type="gramEnd"/>
+      <w:r>
+        <w:rPr>
+          <w:sz w:val="24"/>
+          <w:szCs w:val="24"/>
+        </w:rPr>
+        <w:t xml:space="preserve"> tendo uma velocidade de atendimento </w:t>
+      </w:r>
+      <w:proofErr w:type="gramStart"/>
+      <w:r>
+        <w:rPr>
+          <w:sz w:val="24"/>
+          <w:szCs w:val="24"/>
+        </w:rPr>
+        <w:t>melhor ,</w:t>
+      </w:r>
+      <w:proofErr w:type="gramEnd"/>
+      <w:r>
+        <w:rPr>
+          <w:sz w:val="24"/>
+          <w:szCs w:val="24"/>
+        </w:rPr>
+        <w:t xml:space="preserve"> e um </w:t>
       </w:r>
       <w:proofErr w:type="spellStart"/>
       <w:r>
@@ -3227,7 +3360,39 @@
           <w:sz w:val="24"/>
           <w:szCs w:val="24"/>
         </w:rPr>
-        <w:t xml:space="preserve"> para que os usuários não tenham que procurar atendimento lento , qualidade baixa , não confiável e de alto custo.</w:t>
+        <w:t xml:space="preserve"> para que os usuários não tenham que procurar atendimento </w:t>
+      </w:r>
+      <w:proofErr w:type="gramStart"/>
+      <w:r>
+        <w:rPr>
+          <w:sz w:val="24"/>
+          <w:szCs w:val="24"/>
+        </w:rPr>
+        <w:t>lento ,</w:t>
+      </w:r>
+      <w:proofErr w:type="gramEnd"/>
+      <w:r>
+        <w:rPr>
+          <w:sz w:val="24"/>
+          <w:szCs w:val="24"/>
+        </w:rPr>
+        <w:t xml:space="preserve"> qualidade </w:t>
+      </w:r>
+      <w:proofErr w:type="gramStart"/>
+      <w:r>
+        <w:rPr>
+          <w:sz w:val="24"/>
+          <w:szCs w:val="24"/>
+        </w:rPr>
+        <w:t>baixa ,</w:t>
+      </w:r>
+      <w:proofErr w:type="gramEnd"/>
+      <w:r>
+        <w:rPr>
+          <w:sz w:val="24"/>
+          <w:szCs w:val="24"/>
+        </w:rPr>
+        <w:t xml:space="preserve"> não confiável e de alto custo.</w:t>
       </w:r>
     </w:p>
     <w:p>
@@ -4010,6 +4175,7 @@
         <w:t xml:space="preserve">A coordenação das atividades adotou o Scrum como metodologia </w:t>
       </w:r>
       <w:proofErr w:type="spellStart"/>
+      <w:proofErr w:type="gramStart"/>
       <w:r>
         <w:rPr>
           <w:sz w:val="24"/>
@@ -4025,6 +4191,7 @@
         <w:t>ajudando</w:t>
       </w:r>
       <w:proofErr w:type="spellEnd"/>
+      <w:proofErr w:type="gramEnd"/>
       <w:r>
         <w:rPr>
           <w:sz w:val="24"/>
@@ -4664,14 +4831,6 @@
     </w:p>
     <w:p>
       <w:pPr>
-        <w:rPr>
-          <w:sz w:val="24"/>
-          <w:szCs w:val="24"/>
-        </w:rPr>
-      </w:pPr>
-    </w:p>
-    <w:p>
-      <w:pPr>
         <w:pStyle w:val="Ttulo1"/>
         <w:rPr>
           <w:b/>
@@ -4688,800 +4847,805 @@
           <w:sz w:val="24"/>
           <w:szCs w:val="24"/>
         </w:rPr>
+        <w:t>4</w:t>
+      </w:r>
+      <w:r>
+        <w:rPr>
+          <w:b/>
+          <w:bCs/>
+          <w:sz w:val="24"/>
+          <w:szCs w:val="24"/>
+        </w:rPr>
+        <w:t>.</w:t>
+      </w:r>
+      <w:r>
+        <w:rPr>
+          <w:b/>
+          <w:bCs/>
+          <w:sz w:val="24"/>
+          <w:szCs w:val="24"/>
+        </w:rPr>
+        <w:t>MÉTODOS</w:t>
+      </w:r>
+      <w:bookmarkEnd w:id="5"/>
+    </w:p>
+    <w:p>
+      <w:pPr>
+        <w:rPr>
+          <w:sz w:val="24"/>
+          <w:szCs w:val="24"/>
+        </w:rPr>
+      </w:pPr>
+    </w:p>
+    <w:p>
+      <w:pPr>
+        <w:rPr>
+          <w:sz w:val="24"/>
+          <w:szCs w:val="24"/>
+        </w:rPr>
+      </w:pPr>
+    </w:p>
+    <w:p>
+      <w:pPr>
+        <w:rPr>
+          <w:sz w:val="24"/>
+          <w:szCs w:val="24"/>
+        </w:rPr>
+      </w:pPr>
+    </w:p>
+    <w:p>
+      <w:pPr>
+        <w:rPr>
+          <w:sz w:val="24"/>
+          <w:szCs w:val="24"/>
+        </w:rPr>
+      </w:pPr>
+    </w:p>
+    <w:p>
+      <w:pPr>
+        <w:rPr>
+          <w:sz w:val="24"/>
+          <w:szCs w:val="24"/>
+        </w:rPr>
+      </w:pPr>
+    </w:p>
+    <w:p>
+      <w:pPr>
+        <w:rPr>
+          <w:sz w:val="24"/>
+          <w:szCs w:val="24"/>
+        </w:rPr>
+      </w:pPr>
+    </w:p>
+    <w:p>
+      <w:pPr>
+        <w:rPr>
+          <w:sz w:val="24"/>
+          <w:szCs w:val="24"/>
+        </w:rPr>
+      </w:pPr>
+    </w:p>
+    <w:p>
+      <w:pPr>
+        <w:rPr>
+          <w:sz w:val="24"/>
+          <w:szCs w:val="24"/>
+        </w:rPr>
+      </w:pPr>
+    </w:p>
+    <w:p>
+      <w:pPr>
+        <w:rPr>
+          <w:sz w:val="24"/>
+          <w:szCs w:val="24"/>
+        </w:rPr>
+      </w:pPr>
+    </w:p>
+    <w:p>
+      <w:pPr>
+        <w:rPr>
+          <w:sz w:val="24"/>
+          <w:szCs w:val="24"/>
+        </w:rPr>
+      </w:pPr>
+    </w:p>
+    <w:p>
+      <w:pPr>
+        <w:rPr>
+          <w:sz w:val="24"/>
+          <w:szCs w:val="24"/>
+        </w:rPr>
+      </w:pPr>
+    </w:p>
+    <w:p>
+      <w:pPr>
+        <w:rPr>
+          <w:sz w:val="24"/>
+          <w:szCs w:val="24"/>
+        </w:rPr>
+      </w:pPr>
+    </w:p>
+    <w:p>
+      <w:pPr>
+        <w:rPr>
+          <w:sz w:val="24"/>
+          <w:szCs w:val="24"/>
+        </w:rPr>
+      </w:pPr>
+    </w:p>
+    <w:p>
+      <w:pPr>
+        <w:rPr>
+          <w:sz w:val="24"/>
+          <w:szCs w:val="24"/>
+        </w:rPr>
+      </w:pPr>
+    </w:p>
+    <w:p>
+      <w:pPr>
+        <w:rPr>
+          <w:sz w:val="24"/>
+          <w:szCs w:val="24"/>
+        </w:rPr>
+      </w:pPr>
+    </w:p>
+    <w:p>
+      <w:pPr>
+        <w:rPr>
+          <w:sz w:val="24"/>
+          <w:szCs w:val="24"/>
+        </w:rPr>
+      </w:pPr>
+    </w:p>
+    <w:p>
+      <w:pPr>
+        <w:rPr>
+          <w:sz w:val="24"/>
+          <w:szCs w:val="24"/>
+        </w:rPr>
+      </w:pPr>
+    </w:p>
+    <w:p>
+      <w:pPr>
+        <w:rPr>
+          <w:sz w:val="24"/>
+          <w:szCs w:val="24"/>
+        </w:rPr>
+      </w:pPr>
+    </w:p>
+    <w:p>
+      <w:pPr>
+        <w:rPr>
+          <w:sz w:val="24"/>
+          <w:szCs w:val="24"/>
+        </w:rPr>
+      </w:pPr>
+    </w:p>
+    <w:p>
+      <w:pPr>
+        <w:rPr>
+          <w:sz w:val="24"/>
+          <w:szCs w:val="24"/>
+        </w:rPr>
+      </w:pPr>
+    </w:p>
+    <w:p>
+      <w:pPr>
+        <w:rPr>
+          <w:sz w:val="24"/>
+          <w:szCs w:val="24"/>
+        </w:rPr>
+      </w:pPr>
+    </w:p>
+    <w:p>
+      <w:pPr>
+        <w:rPr>
+          <w:sz w:val="24"/>
+          <w:szCs w:val="24"/>
+        </w:rPr>
+      </w:pPr>
+    </w:p>
+    <w:p>
+      <w:pPr>
+        <w:rPr>
+          <w:sz w:val="24"/>
+          <w:szCs w:val="24"/>
+        </w:rPr>
+      </w:pPr>
+    </w:p>
+    <w:p>
+      <w:pPr>
+        <w:rPr>
+          <w:sz w:val="24"/>
+          <w:szCs w:val="24"/>
+        </w:rPr>
+      </w:pPr>
+    </w:p>
+    <w:p>
+      <w:pPr>
+        <w:rPr>
+          <w:sz w:val="24"/>
+          <w:szCs w:val="24"/>
+        </w:rPr>
+      </w:pPr>
+    </w:p>
+    <w:p>
+      <w:pPr>
+        <w:rPr>
+          <w:sz w:val="24"/>
+          <w:szCs w:val="24"/>
+        </w:rPr>
+      </w:pPr>
+    </w:p>
+    <w:p>
+      <w:pPr>
+        <w:rPr>
+          <w:sz w:val="24"/>
+          <w:szCs w:val="24"/>
+        </w:rPr>
+      </w:pPr>
+    </w:p>
+    <w:p>
+      <w:pPr>
+        <w:rPr>
+          <w:sz w:val="24"/>
+          <w:szCs w:val="24"/>
+        </w:rPr>
+      </w:pPr>
+    </w:p>
+    <w:p>
+      <w:pPr>
+        <w:rPr>
+          <w:sz w:val="24"/>
+          <w:szCs w:val="24"/>
+        </w:rPr>
+      </w:pPr>
+    </w:p>
+    <w:p>
+      <w:pPr>
+        <w:rPr>
+          <w:sz w:val="24"/>
+          <w:szCs w:val="24"/>
+        </w:rPr>
+      </w:pPr>
+    </w:p>
+    <w:p>
+      <w:pPr>
+        <w:rPr>
+          <w:sz w:val="24"/>
+          <w:szCs w:val="24"/>
+        </w:rPr>
+      </w:pPr>
+    </w:p>
+    <w:p>
+      <w:pPr>
+        <w:rPr>
+          <w:sz w:val="24"/>
+          <w:szCs w:val="24"/>
+        </w:rPr>
+      </w:pPr>
+    </w:p>
+    <w:p>
+      <w:pPr>
+        <w:rPr>
+          <w:sz w:val="24"/>
+          <w:szCs w:val="24"/>
+        </w:rPr>
+      </w:pPr>
+    </w:p>
+    <w:p>
+      <w:pPr>
+        <w:rPr>
+          <w:sz w:val="24"/>
+          <w:szCs w:val="24"/>
+        </w:rPr>
+      </w:pPr>
+    </w:p>
+    <w:p>
+      <w:pPr>
+        <w:rPr>
+          <w:sz w:val="24"/>
+          <w:szCs w:val="24"/>
+        </w:rPr>
+      </w:pPr>
+    </w:p>
+    <w:p>
+      <w:pPr>
+        <w:rPr>
+          <w:sz w:val="24"/>
+          <w:szCs w:val="24"/>
+        </w:rPr>
+      </w:pPr>
+    </w:p>
+    <w:p>
+      <w:pPr>
+        <w:rPr>
+          <w:sz w:val="24"/>
+          <w:szCs w:val="24"/>
+        </w:rPr>
+      </w:pPr>
+    </w:p>
+    <w:p>
+      <w:pPr>
+        <w:rPr>
+          <w:sz w:val="24"/>
+          <w:szCs w:val="24"/>
+        </w:rPr>
+      </w:pPr>
+    </w:p>
+    <w:p>
+      <w:pPr>
+        <w:rPr>
+          <w:sz w:val="24"/>
+          <w:szCs w:val="24"/>
+        </w:rPr>
+      </w:pPr>
+    </w:p>
+    <w:p>
+      <w:pPr>
+        <w:rPr>
+          <w:sz w:val="24"/>
+          <w:szCs w:val="24"/>
+        </w:rPr>
+      </w:pPr>
+    </w:p>
+    <w:p>
+      <w:pPr>
+        <w:rPr>
+          <w:sz w:val="24"/>
+          <w:szCs w:val="24"/>
+        </w:rPr>
+      </w:pPr>
+    </w:p>
+    <w:p>
+      <w:pPr>
+        <w:pStyle w:val="Ttulo1"/>
+        <w:rPr>
+          <w:b/>
+          <w:bCs/>
+          <w:sz w:val="24"/>
+          <w:szCs w:val="24"/>
+        </w:rPr>
+      </w:pPr>
+      <w:bookmarkStart w:id="6" w:name="_Toc241048663"/>
+      <w:r>
+        <w:rPr>
+          <w:b/>
+          <w:bCs/>
+          <w:sz w:val="24"/>
+          <w:szCs w:val="24"/>
+        </w:rPr>
+        <w:t>5</w:t>
+      </w:r>
+      <w:r>
+        <w:rPr>
+          <w:b/>
+          <w:bCs/>
+          <w:sz w:val="24"/>
+          <w:szCs w:val="24"/>
+        </w:rPr>
+        <w:t xml:space="preserve">. </w:t>
+      </w:r>
+      <w:r>
+        <w:rPr>
+          <w:b/>
+          <w:bCs/>
+          <w:sz w:val="24"/>
+          <w:szCs w:val="24"/>
+        </w:rPr>
+        <w:t>APRESENTAÇÃO E AN</w:t>
+      </w:r>
+      <w:r>
+        <w:rPr>
+          <w:b/>
+          <w:bCs/>
+          <w:sz w:val="24"/>
+          <w:szCs w:val="24"/>
+        </w:rPr>
+        <w:t>Á</w:t>
+      </w:r>
+      <w:r>
+        <w:rPr>
+          <w:b/>
+          <w:bCs/>
+          <w:sz w:val="24"/>
+          <w:szCs w:val="24"/>
+        </w:rPr>
+        <w:t>LISE DOS RESULTADOS</w:t>
+      </w:r>
+      <w:bookmarkEnd w:id="6"/>
+    </w:p>
+    <w:p>
+      <w:pPr>
+        <w:rPr>
+          <w:sz w:val="24"/>
+          <w:szCs w:val="24"/>
+        </w:rPr>
+      </w:pPr>
+    </w:p>
+    <w:p>
+      <w:pPr>
+        <w:rPr>
+          <w:sz w:val="24"/>
+          <w:szCs w:val="24"/>
+        </w:rPr>
+      </w:pPr>
+    </w:p>
+    <w:p>
+      <w:pPr>
+        <w:rPr>
+          <w:sz w:val="24"/>
+          <w:szCs w:val="24"/>
+        </w:rPr>
+      </w:pPr>
+    </w:p>
+    <w:p>
+      <w:pPr>
+        <w:rPr>
+          <w:sz w:val="24"/>
+          <w:szCs w:val="24"/>
+        </w:rPr>
+      </w:pPr>
+    </w:p>
+    <w:p>
+      <w:pPr>
+        <w:rPr>
+          <w:sz w:val="24"/>
+          <w:szCs w:val="24"/>
+        </w:rPr>
+      </w:pPr>
+    </w:p>
+    <w:p>
+      <w:pPr>
+        <w:rPr>
+          <w:sz w:val="24"/>
+          <w:szCs w:val="24"/>
+        </w:rPr>
+      </w:pPr>
+    </w:p>
+    <w:p>
+      <w:pPr>
+        <w:rPr>
+          <w:sz w:val="24"/>
+          <w:szCs w:val="24"/>
+        </w:rPr>
+      </w:pPr>
+    </w:p>
+    <w:p>
+      <w:pPr>
+        <w:rPr>
+          <w:sz w:val="24"/>
+          <w:szCs w:val="24"/>
+        </w:rPr>
+      </w:pPr>
+    </w:p>
+    <w:p>
+      <w:pPr>
+        <w:rPr>
+          <w:sz w:val="24"/>
+          <w:szCs w:val="24"/>
+        </w:rPr>
+      </w:pPr>
+    </w:p>
+    <w:p>
+      <w:pPr>
+        <w:rPr>
+          <w:sz w:val="24"/>
+          <w:szCs w:val="24"/>
+        </w:rPr>
+      </w:pPr>
+    </w:p>
+    <w:p>
+      <w:pPr>
+        <w:rPr>
+          <w:sz w:val="24"/>
+          <w:szCs w:val="24"/>
+        </w:rPr>
+      </w:pPr>
+    </w:p>
+    <w:p>
+      <w:pPr>
+        <w:rPr>
+          <w:sz w:val="24"/>
+          <w:szCs w:val="24"/>
+        </w:rPr>
+      </w:pPr>
+    </w:p>
+    <w:p>
+      <w:pPr>
+        <w:rPr>
+          <w:sz w:val="24"/>
+          <w:szCs w:val="24"/>
+        </w:rPr>
+      </w:pPr>
+    </w:p>
+    <w:p>
+      <w:pPr>
+        <w:rPr>
+          <w:sz w:val="24"/>
+          <w:szCs w:val="24"/>
+        </w:rPr>
+      </w:pPr>
+    </w:p>
+    <w:p>
+      <w:pPr>
+        <w:rPr>
+          <w:sz w:val="24"/>
+          <w:szCs w:val="24"/>
+        </w:rPr>
+      </w:pPr>
+    </w:p>
+    <w:p>
+      <w:pPr>
+        <w:rPr>
+          <w:sz w:val="24"/>
+          <w:szCs w:val="24"/>
+        </w:rPr>
+      </w:pPr>
+    </w:p>
+    <w:p>
+      <w:pPr>
+        <w:rPr>
+          <w:sz w:val="24"/>
+          <w:szCs w:val="24"/>
+        </w:rPr>
+      </w:pPr>
+    </w:p>
+    <w:p>
+      <w:pPr>
+        <w:rPr>
+          <w:sz w:val="24"/>
+          <w:szCs w:val="24"/>
+        </w:rPr>
+      </w:pPr>
+    </w:p>
+    <w:p>
+      <w:pPr>
+        <w:rPr>
+          <w:sz w:val="24"/>
+          <w:szCs w:val="24"/>
+        </w:rPr>
+      </w:pPr>
+    </w:p>
+    <w:p>
+      <w:pPr>
+        <w:rPr>
+          <w:sz w:val="24"/>
+          <w:szCs w:val="24"/>
+        </w:rPr>
+      </w:pPr>
+    </w:p>
+    <w:p>
+      <w:pPr>
+        <w:rPr>
+          <w:sz w:val="24"/>
+          <w:szCs w:val="24"/>
+        </w:rPr>
+      </w:pPr>
+    </w:p>
+    <w:p>
+      <w:pPr>
+        <w:rPr>
+          <w:sz w:val="24"/>
+          <w:szCs w:val="24"/>
+        </w:rPr>
+      </w:pPr>
+    </w:p>
+    <w:p>
+      <w:pPr>
+        <w:rPr>
+          <w:sz w:val="24"/>
+          <w:szCs w:val="24"/>
+        </w:rPr>
+      </w:pPr>
+    </w:p>
+    <w:p>
+      <w:pPr>
+        <w:rPr>
+          <w:sz w:val="24"/>
+          <w:szCs w:val="24"/>
+        </w:rPr>
+      </w:pPr>
+    </w:p>
+    <w:p>
+      <w:pPr>
+        <w:rPr>
+          <w:sz w:val="24"/>
+          <w:szCs w:val="24"/>
+        </w:rPr>
+      </w:pPr>
+    </w:p>
+    <w:p>
+      <w:pPr>
+        <w:rPr>
+          <w:sz w:val="24"/>
+          <w:szCs w:val="24"/>
+        </w:rPr>
+      </w:pPr>
+    </w:p>
+    <w:p>
+      <w:pPr>
+        <w:rPr>
+          <w:sz w:val="24"/>
+          <w:szCs w:val="24"/>
+        </w:rPr>
+      </w:pPr>
+    </w:p>
+    <w:p>
+      <w:pPr>
+        <w:rPr>
+          <w:sz w:val="24"/>
+          <w:szCs w:val="24"/>
+        </w:rPr>
+      </w:pPr>
+    </w:p>
+    <w:p>
+      <w:pPr>
+        <w:rPr>
+          <w:sz w:val="24"/>
+          <w:szCs w:val="24"/>
+        </w:rPr>
+      </w:pPr>
+    </w:p>
+    <w:p>
+      <w:pPr>
+        <w:rPr>
+          <w:sz w:val="24"/>
+          <w:szCs w:val="24"/>
+        </w:rPr>
+      </w:pPr>
+    </w:p>
+    <w:p>
+      <w:pPr>
+        <w:rPr>
+          <w:sz w:val="24"/>
+          <w:szCs w:val="24"/>
+        </w:rPr>
+      </w:pPr>
+    </w:p>
+    <w:p>
+      <w:pPr>
+        <w:rPr>
+          <w:sz w:val="24"/>
+          <w:szCs w:val="24"/>
+        </w:rPr>
+      </w:pPr>
+    </w:p>
+    <w:p>
+      <w:pPr>
+        <w:rPr>
+          <w:sz w:val="24"/>
+          <w:szCs w:val="24"/>
+        </w:rPr>
+      </w:pPr>
+    </w:p>
+    <w:p>
+      <w:pPr>
+        <w:rPr>
+          <w:sz w:val="24"/>
+          <w:szCs w:val="24"/>
+        </w:rPr>
+      </w:pPr>
+    </w:p>
+    <w:p>
+      <w:pPr>
+        <w:rPr>
+          <w:sz w:val="24"/>
+          <w:szCs w:val="24"/>
+        </w:rPr>
+      </w:pPr>
+    </w:p>
+    <w:p>
+      <w:pPr>
+        <w:rPr>
+          <w:sz w:val="24"/>
+          <w:szCs w:val="24"/>
+        </w:rPr>
+      </w:pPr>
+    </w:p>
+    <w:p>
+      <w:pPr>
+        <w:rPr>
+          <w:sz w:val="24"/>
+          <w:szCs w:val="24"/>
+        </w:rPr>
+      </w:pPr>
+    </w:p>
+    <w:p>
+      <w:pPr>
+        <w:rPr>
+          <w:sz w:val="24"/>
+          <w:szCs w:val="24"/>
+        </w:rPr>
+      </w:pPr>
+    </w:p>
+    <w:p>
+      <w:pPr>
+        <w:rPr>
+          <w:sz w:val="24"/>
+          <w:szCs w:val="24"/>
+        </w:rPr>
+      </w:pPr>
+    </w:p>
+    <w:p>
+      <w:pPr>
+        <w:rPr>
+          <w:sz w:val="24"/>
+          <w:szCs w:val="24"/>
+        </w:rPr>
+      </w:pPr>
+    </w:p>
+    <w:p>
+      <w:pPr>
+        <w:pStyle w:val="Ttulo1"/>
+        <w:rPr>
+          <w:b/>
+          <w:bCs/>
+          <w:sz w:val="24"/>
+          <w:szCs w:val="24"/>
+        </w:rPr>
+      </w:pPr>
+      <w:bookmarkStart w:id="7" w:name="_Toc241048664"/>
+      <w:r>
+        <w:rPr>
+          <w:b/>
+          <w:bCs/>
+          <w:sz w:val="24"/>
+          <w:szCs w:val="24"/>
+        </w:rPr>
+        <w:t>6</w:t>
+      </w:r>
+      <w:r>
+        <w:rPr>
+          <w:b/>
+          <w:bCs/>
+          <w:sz w:val="24"/>
+          <w:szCs w:val="24"/>
+        </w:rPr>
+        <w:t>.</w:t>
+      </w:r>
+      <w:r>
+        <w:rPr>
+          <w:b/>
+          <w:bCs/>
+          <w:sz w:val="24"/>
+          <w:szCs w:val="24"/>
+        </w:rPr>
+        <w:t>CONCLUSÃO</w:t>
+      </w:r>
+      <w:bookmarkEnd w:id="7"/>
+    </w:p>
+    <w:p>
+      <w:pPr>
+        <w:rPr>
+          <w:sz w:val="24"/>
+          <w:szCs w:val="24"/>
+        </w:rPr>
+      </w:pPr>
+    </w:p>
+    <w:p>
+      <w:pPr>
+        <w:rPr>
+          <w:sz w:val="24"/>
+          <w:szCs w:val="24"/>
+        </w:rPr>
+      </w:pPr>
+    </w:p>
+    <w:p>
+      <w:pPr>
+        <w:rPr>
+          <w:sz w:val="24"/>
+          <w:szCs w:val="24"/>
+        </w:rPr>
+      </w:pPr>
+      <w:r>
+        <w:rPr>
+          <w:sz w:val="24"/>
+          <w:szCs w:val="24"/>
+        </w:rPr>
         <w:lastRenderedPageBreak/>
-        <w:t>4</w:t>
-      </w:r>
-      <w:r>
-        <w:rPr>
-          <w:b/>
-          <w:bCs/>
-          <w:sz w:val="24"/>
-          <w:szCs w:val="24"/>
-        </w:rPr>
         <w:t>.</w:t>
       </w:r>
-      <w:r>
-        <w:rPr>
-          <w:b/>
-          <w:bCs/>
-          <w:sz w:val="24"/>
-          <w:szCs w:val="24"/>
-        </w:rPr>
-        <w:t>MÉTODOS</w:t>
-      </w:r>
-      <w:bookmarkEnd w:id="5"/>
-    </w:p>
-    <w:p>
-      <w:pPr>
-        <w:rPr>
-          <w:sz w:val="24"/>
-          <w:szCs w:val="24"/>
-        </w:rPr>
-      </w:pPr>
-    </w:p>
-    <w:p>
-      <w:pPr>
-        <w:rPr>
-          <w:sz w:val="24"/>
-          <w:szCs w:val="24"/>
-        </w:rPr>
-      </w:pPr>
-    </w:p>
-    <w:p>
-      <w:pPr>
-        <w:rPr>
-          <w:sz w:val="24"/>
-          <w:szCs w:val="24"/>
-        </w:rPr>
-      </w:pPr>
-    </w:p>
-    <w:p>
-      <w:pPr>
-        <w:rPr>
-          <w:sz w:val="24"/>
-          <w:szCs w:val="24"/>
-        </w:rPr>
-      </w:pPr>
-    </w:p>
-    <w:p>
-      <w:pPr>
-        <w:rPr>
-          <w:sz w:val="24"/>
-          <w:szCs w:val="24"/>
-        </w:rPr>
-      </w:pPr>
-    </w:p>
-    <w:p>
-      <w:pPr>
-        <w:rPr>
-          <w:sz w:val="24"/>
-          <w:szCs w:val="24"/>
-        </w:rPr>
-      </w:pPr>
-    </w:p>
-    <w:p>
-      <w:pPr>
-        <w:rPr>
-          <w:sz w:val="24"/>
-          <w:szCs w:val="24"/>
-        </w:rPr>
-      </w:pPr>
-    </w:p>
-    <w:p>
-      <w:pPr>
-        <w:rPr>
-          <w:sz w:val="24"/>
-          <w:szCs w:val="24"/>
-        </w:rPr>
-      </w:pPr>
-    </w:p>
-    <w:p>
-      <w:pPr>
-        <w:rPr>
-          <w:sz w:val="24"/>
-          <w:szCs w:val="24"/>
-        </w:rPr>
-      </w:pPr>
-    </w:p>
-    <w:p>
-      <w:pPr>
-        <w:rPr>
-          <w:sz w:val="24"/>
-          <w:szCs w:val="24"/>
-        </w:rPr>
-      </w:pPr>
-    </w:p>
-    <w:p>
-      <w:pPr>
-        <w:rPr>
-          <w:sz w:val="24"/>
-          <w:szCs w:val="24"/>
-        </w:rPr>
-      </w:pPr>
-    </w:p>
-    <w:p>
-      <w:pPr>
-        <w:rPr>
-          <w:sz w:val="24"/>
-          <w:szCs w:val="24"/>
-        </w:rPr>
-      </w:pPr>
-    </w:p>
-    <w:p>
-      <w:pPr>
-        <w:rPr>
-          <w:sz w:val="24"/>
-          <w:szCs w:val="24"/>
-        </w:rPr>
-      </w:pPr>
-    </w:p>
-    <w:p>
-      <w:pPr>
-        <w:rPr>
-          <w:sz w:val="24"/>
-          <w:szCs w:val="24"/>
-        </w:rPr>
-      </w:pPr>
-    </w:p>
-    <w:p>
-      <w:pPr>
-        <w:rPr>
-          <w:sz w:val="24"/>
-          <w:szCs w:val="24"/>
-        </w:rPr>
-      </w:pPr>
-    </w:p>
-    <w:p>
-      <w:pPr>
-        <w:rPr>
-          <w:sz w:val="24"/>
-          <w:szCs w:val="24"/>
-        </w:rPr>
-      </w:pPr>
-    </w:p>
-    <w:p>
-      <w:pPr>
-        <w:rPr>
-          <w:sz w:val="24"/>
-          <w:szCs w:val="24"/>
-        </w:rPr>
-      </w:pPr>
-    </w:p>
-    <w:p>
-      <w:pPr>
-        <w:rPr>
-          <w:sz w:val="24"/>
-          <w:szCs w:val="24"/>
-        </w:rPr>
-      </w:pPr>
-    </w:p>
-    <w:p>
-      <w:pPr>
-        <w:rPr>
-          <w:sz w:val="24"/>
-          <w:szCs w:val="24"/>
-        </w:rPr>
-      </w:pPr>
-    </w:p>
-    <w:p>
-      <w:pPr>
-        <w:rPr>
-          <w:sz w:val="24"/>
-          <w:szCs w:val="24"/>
-        </w:rPr>
-      </w:pPr>
-    </w:p>
-    <w:p>
-      <w:pPr>
-        <w:rPr>
-          <w:sz w:val="24"/>
-          <w:szCs w:val="24"/>
-        </w:rPr>
-      </w:pPr>
-    </w:p>
-    <w:p>
-      <w:pPr>
-        <w:rPr>
-          <w:sz w:val="24"/>
-          <w:szCs w:val="24"/>
-        </w:rPr>
-      </w:pPr>
-    </w:p>
-    <w:p>
-      <w:pPr>
-        <w:rPr>
-          <w:sz w:val="24"/>
-          <w:szCs w:val="24"/>
-        </w:rPr>
-      </w:pPr>
-    </w:p>
-    <w:p>
-      <w:pPr>
-        <w:rPr>
-          <w:sz w:val="24"/>
-          <w:szCs w:val="24"/>
-        </w:rPr>
-      </w:pPr>
-    </w:p>
-    <w:p>
-      <w:pPr>
-        <w:rPr>
-          <w:sz w:val="24"/>
-          <w:szCs w:val="24"/>
-        </w:rPr>
-      </w:pPr>
-    </w:p>
-    <w:p>
-      <w:pPr>
-        <w:rPr>
-          <w:sz w:val="24"/>
-          <w:szCs w:val="24"/>
-        </w:rPr>
-      </w:pPr>
-    </w:p>
-    <w:p>
-      <w:pPr>
-        <w:rPr>
-          <w:sz w:val="24"/>
-          <w:szCs w:val="24"/>
-        </w:rPr>
-      </w:pPr>
-    </w:p>
-    <w:p>
-      <w:pPr>
-        <w:rPr>
-          <w:sz w:val="24"/>
-          <w:szCs w:val="24"/>
-        </w:rPr>
-      </w:pPr>
-    </w:p>
-    <w:p>
-      <w:pPr>
-        <w:rPr>
-          <w:sz w:val="24"/>
-          <w:szCs w:val="24"/>
-        </w:rPr>
-      </w:pPr>
-    </w:p>
-    <w:p>
-      <w:pPr>
-        <w:rPr>
-          <w:sz w:val="24"/>
-          <w:szCs w:val="24"/>
-        </w:rPr>
-      </w:pPr>
-    </w:p>
-    <w:p>
-      <w:pPr>
-        <w:rPr>
-          <w:sz w:val="24"/>
-          <w:szCs w:val="24"/>
-        </w:rPr>
-      </w:pPr>
-    </w:p>
-    <w:p>
-      <w:pPr>
-        <w:rPr>
-          <w:sz w:val="24"/>
-          <w:szCs w:val="24"/>
-        </w:rPr>
-      </w:pPr>
-    </w:p>
-    <w:p>
-      <w:pPr>
-        <w:rPr>
-          <w:sz w:val="24"/>
-          <w:szCs w:val="24"/>
-        </w:rPr>
-      </w:pPr>
-    </w:p>
-    <w:p>
-      <w:pPr>
-        <w:rPr>
-          <w:sz w:val="24"/>
-          <w:szCs w:val="24"/>
-        </w:rPr>
-      </w:pPr>
-    </w:p>
-    <w:p>
-      <w:pPr>
-        <w:rPr>
-          <w:sz w:val="24"/>
-          <w:szCs w:val="24"/>
-        </w:rPr>
-      </w:pPr>
-    </w:p>
-    <w:p>
-      <w:pPr>
-        <w:rPr>
-          <w:sz w:val="24"/>
-          <w:szCs w:val="24"/>
-        </w:rPr>
-      </w:pPr>
-    </w:p>
-    <w:p>
-      <w:pPr>
-        <w:rPr>
-          <w:sz w:val="24"/>
-          <w:szCs w:val="24"/>
-        </w:rPr>
-      </w:pPr>
-    </w:p>
-    <w:p>
-      <w:pPr>
-        <w:rPr>
-          <w:sz w:val="24"/>
-          <w:szCs w:val="24"/>
-        </w:rPr>
-      </w:pPr>
-    </w:p>
-    <w:p>
-      <w:pPr>
-        <w:rPr>
-          <w:sz w:val="24"/>
-          <w:szCs w:val="24"/>
-        </w:rPr>
-      </w:pPr>
-    </w:p>
-    <w:p>
-      <w:pPr>
-        <w:rPr>
-          <w:sz w:val="24"/>
-          <w:szCs w:val="24"/>
-        </w:rPr>
-      </w:pPr>
-    </w:p>
-    <w:p>
-      <w:pPr>
-        <w:rPr>
-          <w:sz w:val="24"/>
-          <w:szCs w:val="24"/>
-        </w:rPr>
-      </w:pPr>
-    </w:p>
-    <w:p>
-      <w:pPr>
-        <w:pStyle w:val="Ttulo1"/>
-        <w:rPr>
-          <w:b/>
-          <w:bCs/>
-          <w:sz w:val="24"/>
-          <w:szCs w:val="24"/>
-        </w:rPr>
-      </w:pPr>
-      <w:bookmarkStart w:id="6" w:name="_Toc241048663"/>
-      <w:r>
-        <w:rPr>
-          <w:b/>
-          <w:bCs/>
-          <w:sz w:val="24"/>
-          <w:szCs w:val="24"/>
-        </w:rPr>
-        <w:lastRenderedPageBreak/>
-        <w:t>5</w:t>
-      </w:r>
-      <w:r>
-        <w:rPr>
-          <w:b/>
-          <w:bCs/>
-          <w:sz w:val="24"/>
-          <w:szCs w:val="24"/>
-        </w:rPr>
-        <w:t xml:space="preserve">. </w:t>
-      </w:r>
-      <w:r>
-        <w:rPr>
-          <w:b/>
-          <w:bCs/>
-          <w:sz w:val="24"/>
-          <w:szCs w:val="24"/>
-        </w:rPr>
-        <w:t>APRESENTAÇÃO E AN</w:t>
-      </w:r>
-      <w:r>
-        <w:rPr>
-          <w:b/>
-          <w:bCs/>
-          <w:sz w:val="24"/>
-          <w:szCs w:val="24"/>
-        </w:rPr>
-        <w:t>Á</w:t>
-      </w:r>
-      <w:r>
-        <w:rPr>
-          <w:b/>
-          <w:bCs/>
-          <w:sz w:val="24"/>
-          <w:szCs w:val="24"/>
-        </w:rPr>
-        <w:t>LISE DOS RESULTADOS</w:t>
-      </w:r>
-      <w:bookmarkEnd w:id="6"/>
-    </w:p>
-    <w:p>
-      <w:pPr>
-        <w:rPr>
-          <w:sz w:val="24"/>
-          <w:szCs w:val="24"/>
-        </w:rPr>
-      </w:pPr>
-    </w:p>
-    <w:p>
-      <w:pPr>
-        <w:rPr>
-          <w:sz w:val="24"/>
-          <w:szCs w:val="24"/>
-        </w:rPr>
-      </w:pPr>
-    </w:p>
-    <w:p>
-      <w:pPr>
-        <w:rPr>
-          <w:sz w:val="24"/>
-          <w:szCs w:val="24"/>
-        </w:rPr>
-      </w:pPr>
-    </w:p>
-    <w:p>
-      <w:pPr>
-        <w:rPr>
-          <w:sz w:val="24"/>
-          <w:szCs w:val="24"/>
-        </w:rPr>
-      </w:pPr>
-    </w:p>
-    <w:p>
-      <w:pPr>
-        <w:rPr>
-          <w:sz w:val="24"/>
-          <w:szCs w:val="24"/>
-        </w:rPr>
-      </w:pPr>
-    </w:p>
-    <w:p>
-      <w:pPr>
-        <w:rPr>
-          <w:sz w:val="24"/>
-          <w:szCs w:val="24"/>
-        </w:rPr>
-      </w:pPr>
-    </w:p>
-    <w:p>
-      <w:pPr>
-        <w:rPr>
-          <w:sz w:val="24"/>
-          <w:szCs w:val="24"/>
-        </w:rPr>
-      </w:pPr>
-    </w:p>
-    <w:p>
-      <w:pPr>
-        <w:rPr>
-          <w:sz w:val="24"/>
-          <w:szCs w:val="24"/>
-        </w:rPr>
-      </w:pPr>
-    </w:p>
-    <w:p>
-      <w:pPr>
-        <w:rPr>
-          <w:sz w:val="24"/>
-          <w:szCs w:val="24"/>
-        </w:rPr>
-      </w:pPr>
-    </w:p>
-    <w:p>
-      <w:pPr>
-        <w:rPr>
-          <w:sz w:val="24"/>
-          <w:szCs w:val="24"/>
-        </w:rPr>
-      </w:pPr>
-    </w:p>
-    <w:p>
-      <w:pPr>
-        <w:rPr>
-          <w:sz w:val="24"/>
-          <w:szCs w:val="24"/>
-        </w:rPr>
-      </w:pPr>
-    </w:p>
-    <w:p>
-      <w:pPr>
-        <w:rPr>
-          <w:sz w:val="24"/>
-          <w:szCs w:val="24"/>
-        </w:rPr>
-      </w:pPr>
-    </w:p>
-    <w:p>
-      <w:pPr>
-        <w:rPr>
-          <w:sz w:val="24"/>
-          <w:szCs w:val="24"/>
-        </w:rPr>
-      </w:pPr>
-    </w:p>
-    <w:p>
-      <w:pPr>
-        <w:rPr>
-          <w:sz w:val="24"/>
-          <w:szCs w:val="24"/>
-        </w:rPr>
-      </w:pPr>
-    </w:p>
-    <w:p>
-      <w:pPr>
-        <w:rPr>
-          <w:sz w:val="24"/>
-          <w:szCs w:val="24"/>
-        </w:rPr>
-      </w:pPr>
-    </w:p>
-    <w:p>
-      <w:pPr>
-        <w:rPr>
-          <w:sz w:val="24"/>
-          <w:szCs w:val="24"/>
-        </w:rPr>
-      </w:pPr>
-    </w:p>
-    <w:p>
-      <w:pPr>
-        <w:rPr>
-          <w:sz w:val="24"/>
-          <w:szCs w:val="24"/>
-        </w:rPr>
-      </w:pPr>
-    </w:p>
-    <w:p>
-      <w:pPr>
-        <w:rPr>
-          <w:sz w:val="24"/>
-          <w:szCs w:val="24"/>
-        </w:rPr>
-      </w:pPr>
-    </w:p>
-    <w:p>
-      <w:pPr>
-        <w:rPr>
-          <w:sz w:val="24"/>
-          <w:szCs w:val="24"/>
-        </w:rPr>
-      </w:pPr>
-    </w:p>
-    <w:p>
-      <w:pPr>
-        <w:rPr>
-          <w:sz w:val="24"/>
-          <w:szCs w:val="24"/>
-        </w:rPr>
-      </w:pPr>
-    </w:p>
-    <w:p>
-      <w:pPr>
-        <w:rPr>
-          <w:sz w:val="24"/>
-          <w:szCs w:val="24"/>
-        </w:rPr>
-      </w:pPr>
-    </w:p>
-    <w:p>
-      <w:pPr>
-        <w:rPr>
-          <w:sz w:val="24"/>
-          <w:szCs w:val="24"/>
-        </w:rPr>
-      </w:pPr>
-    </w:p>
-    <w:p>
-      <w:pPr>
-        <w:rPr>
-          <w:sz w:val="24"/>
-          <w:szCs w:val="24"/>
-        </w:rPr>
-      </w:pPr>
-    </w:p>
-    <w:p>
-      <w:pPr>
-        <w:rPr>
-          <w:sz w:val="24"/>
-          <w:szCs w:val="24"/>
-        </w:rPr>
-      </w:pPr>
-    </w:p>
-    <w:p>
-      <w:pPr>
-        <w:rPr>
-          <w:sz w:val="24"/>
-          <w:szCs w:val="24"/>
-        </w:rPr>
-      </w:pPr>
-    </w:p>
-    <w:p>
-      <w:pPr>
-        <w:rPr>
-          <w:sz w:val="24"/>
-          <w:szCs w:val="24"/>
-        </w:rPr>
-      </w:pPr>
-    </w:p>
-    <w:p>
-      <w:pPr>
-        <w:rPr>
-          <w:sz w:val="24"/>
-          <w:szCs w:val="24"/>
-        </w:rPr>
-      </w:pPr>
-    </w:p>
-    <w:p>
-      <w:pPr>
-        <w:rPr>
-          <w:sz w:val="24"/>
-          <w:szCs w:val="24"/>
-        </w:rPr>
-      </w:pPr>
-    </w:p>
-    <w:p>
-      <w:pPr>
-        <w:rPr>
-          <w:sz w:val="24"/>
-          <w:szCs w:val="24"/>
-        </w:rPr>
-      </w:pPr>
-    </w:p>
-    <w:p>
-      <w:pPr>
-        <w:rPr>
-          <w:sz w:val="24"/>
-          <w:szCs w:val="24"/>
-        </w:rPr>
-      </w:pPr>
-    </w:p>
-    <w:p>
-      <w:pPr>
-        <w:rPr>
-          <w:sz w:val="24"/>
-          <w:szCs w:val="24"/>
-        </w:rPr>
-      </w:pPr>
-    </w:p>
-    <w:p>
-      <w:pPr>
-        <w:rPr>
-          <w:sz w:val="24"/>
-          <w:szCs w:val="24"/>
-        </w:rPr>
-      </w:pPr>
-    </w:p>
-    <w:p>
-      <w:pPr>
-        <w:rPr>
-          <w:sz w:val="24"/>
-          <w:szCs w:val="24"/>
-        </w:rPr>
-      </w:pPr>
-    </w:p>
-    <w:p>
-      <w:pPr>
-        <w:rPr>
-          <w:sz w:val="24"/>
-          <w:szCs w:val="24"/>
-        </w:rPr>
-      </w:pPr>
-    </w:p>
-    <w:p>
-      <w:pPr>
-        <w:rPr>
-          <w:sz w:val="24"/>
-          <w:szCs w:val="24"/>
-        </w:rPr>
-      </w:pPr>
-    </w:p>
-    <w:p>
-      <w:pPr>
-        <w:rPr>
-          <w:sz w:val="24"/>
-          <w:szCs w:val="24"/>
-        </w:rPr>
-      </w:pPr>
-    </w:p>
-    <w:p>
-      <w:pPr>
-        <w:rPr>
-          <w:sz w:val="24"/>
-          <w:szCs w:val="24"/>
-        </w:rPr>
-      </w:pPr>
-    </w:p>
-    <w:p>
-      <w:pPr>
-        <w:rPr>
-          <w:sz w:val="24"/>
-          <w:szCs w:val="24"/>
-        </w:rPr>
-      </w:pPr>
-    </w:p>
-    <w:p>
-      <w:pPr>
-        <w:rPr>
-          <w:sz w:val="24"/>
-          <w:szCs w:val="24"/>
-        </w:rPr>
-      </w:pPr>
-    </w:p>
-    <w:p>
-      <w:pPr>
-        <w:rPr>
-          <w:sz w:val="24"/>
-          <w:szCs w:val="24"/>
-        </w:rPr>
-      </w:pPr>
-    </w:p>
-    <w:p>
-      <w:pPr>
-        <w:pStyle w:val="Ttulo1"/>
-        <w:rPr>
-          <w:b/>
-          <w:bCs/>
-          <w:sz w:val="24"/>
-          <w:szCs w:val="24"/>
-        </w:rPr>
-      </w:pPr>
-      <w:bookmarkStart w:id="7" w:name="_Toc241048664"/>
-      <w:r>
-        <w:rPr>
-          <w:b/>
-          <w:bCs/>
-          <w:sz w:val="24"/>
-          <w:szCs w:val="24"/>
-        </w:rPr>
-        <w:lastRenderedPageBreak/>
-        <w:t>6</w:t>
-      </w:r>
-      <w:r>
-        <w:rPr>
-          <w:b/>
-          <w:bCs/>
-          <w:sz w:val="24"/>
-          <w:szCs w:val="24"/>
-        </w:rPr>
-        <w:t>.</w:t>
-      </w:r>
-      <w:r>
-        <w:rPr>
-          <w:b/>
-          <w:bCs/>
-          <w:sz w:val="24"/>
-          <w:szCs w:val="24"/>
-        </w:rPr>
-        <w:t>CONCLUSÃO</w:t>
-      </w:r>
-      <w:bookmarkEnd w:id="7"/>
-    </w:p>
-    <w:p>
-      <w:pPr>
-        <w:rPr>
-          <w:sz w:val="24"/>
-          <w:szCs w:val="24"/>
-        </w:rPr>
-      </w:pPr>
-    </w:p>
-    <w:p>
-      <w:pPr>
-        <w:rPr>
-          <w:sz w:val="24"/>
-          <w:szCs w:val="24"/>
-        </w:rPr>
-      </w:pPr>
-    </w:p>
-    <w:p>
-      <w:pPr>
-        <w:rPr>
-          <w:sz w:val="24"/>
-          <w:szCs w:val="24"/>
-        </w:rPr>
-      </w:pPr>
     </w:p>
     <w:p>
       <w:pPr>
@@ -6228,7 +6392,6 @@
   <w:style w:type="character" w:default="1" w:styleId="Fontepargpadro">
     <w:name w:val="Default Paragraph Font"/>
     <w:uiPriority w:val="1"/>
-    <w:semiHidden/>
     <w:unhideWhenUsed/>
   </w:style>
   <w:style w:type="table" w:default="1" w:styleId="Tabelanormal">

</xml_diff>